<commit_message>
One function to check input.
</commit_message>
<xml_diff>
--- a/templates/APPLICATION_doc.docx
+++ b/templates/APPLICATION_doc.docx
@@ -82,577 +82,345 @@
         <w:rPr>
           <w:lang w:val="en-US"/>
         </w:rPr>
-        <w:t xml:space="preserve">Last Name: </w:t>
-      </w:r>
-      <w:proofErr w:type="gramStart"/>
-      <w:r>
-        <w:rPr>
-          <w:lang w:val="en-US"/>
-        </w:rPr>
-        <w:t xml:space="preserve">{{ </w:t>
+        <w:t>Last Name: {{</w:t>
       </w:r>
       <w:proofErr w:type="spellStart"/>
       <w:r>
         <w:rPr>
           <w:lang w:val="en-US"/>
         </w:rPr>
-        <w:t>last</w:t>
-      </w:r>
-      <w:proofErr w:type="gramEnd"/>
-      <w:r>
-        <w:rPr>
-          <w:lang w:val="en-US"/>
-        </w:rPr>
-        <w:t>_</w:t>
-      </w:r>
-      <w:proofErr w:type="gramStart"/>
+        <w:t>last_name</w:t>
+      </w:r>
+      <w:proofErr w:type="spellEnd"/>
+      <w:r>
+        <w:rPr>
+          <w:lang w:val="en-US"/>
+        </w:rPr>
+        <w:t>}}</w:t>
+      </w:r>
+    </w:p>
+    <w:p>
+      <w:pPr>
+        <w:rPr>
+          <w:lang w:val="en-US"/>
+        </w:rPr>
+      </w:pPr>
+      <w:r>
+        <w:rPr>
+          <w:lang w:val="en-US"/>
+        </w:rPr>
+        <w:t>Name: {{</w:t>
+      </w:r>
       <w:r>
         <w:rPr>
           <w:lang w:val="en-US"/>
         </w:rPr>
         <w:t>name</w:t>
       </w:r>
+      <w:r>
+        <w:rPr>
+          <w:lang w:val="en-US"/>
+        </w:rPr>
+        <w:t>}}</w:t>
+      </w:r>
+    </w:p>
+    <w:p>
+      <w:pPr>
+        <w:rPr>
+          <w:lang w:val="en-US"/>
+        </w:rPr>
+      </w:pPr>
+      <w:r>
+        <w:rPr>
+          <w:lang w:val="en-US"/>
+        </w:rPr>
+        <w:t>Father’s Name: {{</w:t>
+      </w:r>
+      <w:proofErr w:type="spellStart"/>
+      <w:r>
+        <w:rPr>
+          <w:lang w:val="en-US"/>
+        </w:rPr>
+        <w:t>fathers_name</w:t>
+      </w:r>
       <w:proofErr w:type="spellEnd"/>
       <w:r>
         <w:rPr>
           <w:lang w:val="en-US"/>
         </w:rPr>
-        <w:t xml:space="preserve"> }</w:t>
-      </w:r>
-      <w:proofErr w:type="gramEnd"/>
-      <w:r>
-        <w:rPr>
-          <w:lang w:val="en-US"/>
-        </w:rPr>
-        <w:t>}</w:t>
-      </w:r>
-    </w:p>
-    <w:p>
-      <w:pPr>
-        <w:rPr>
-          <w:lang w:val="en-US"/>
-        </w:rPr>
-      </w:pPr>
-      <w:r>
-        <w:rPr>
-          <w:lang w:val="en-US"/>
-        </w:rPr>
-        <w:t xml:space="preserve">Name: </w:t>
-      </w:r>
-      <w:proofErr w:type="gramStart"/>
-      <w:r>
-        <w:rPr>
-          <w:lang w:val="en-US"/>
-        </w:rPr>
-        <w:t>{{ name</w:t>
-      </w:r>
-      <w:proofErr w:type="gramEnd"/>
-      <w:r>
-        <w:rPr>
-          <w:lang w:val="en-US"/>
-        </w:rPr>
-        <w:t xml:space="preserve"> }}</w:t>
-      </w:r>
-    </w:p>
-    <w:p>
-      <w:pPr>
-        <w:rPr>
-          <w:lang w:val="en-US"/>
-        </w:rPr>
-      </w:pPr>
-      <w:r>
-        <w:rPr>
-          <w:lang w:val="en-US"/>
-        </w:rPr>
-        <w:t xml:space="preserve">Father’s Name: </w:t>
-      </w:r>
-      <w:proofErr w:type="gramStart"/>
-      <w:r>
-        <w:rPr>
-          <w:lang w:val="en-US"/>
-        </w:rPr>
-        <w:t xml:space="preserve">{{ </w:t>
+        <w:t>}}</w:t>
+      </w:r>
+    </w:p>
+    <w:p>
+      <w:pPr>
+        <w:rPr>
+          <w:lang w:val="en-US"/>
+        </w:rPr>
+      </w:pPr>
+      <w:r>
+        <w:rPr>
+          <w:lang w:val="en-US"/>
+        </w:rPr>
+        <w:t>Mother’s Name: {{</w:t>
       </w:r>
       <w:proofErr w:type="spellStart"/>
       <w:r>
         <w:rPr>
           <w:lang w:val="en-US"/>
         </w:rPr>
-        <w:t>fathers</w:t>
-      </w:r>
-      <w:proofErr w:type="gramEnd"/>
-      <w:r>
-        <w:rPr>
-          <w:lang w:val="en-US"/>
-        </w:rPr>
-        <w:t>_</w:t>
-      </w:r>
-      <w:proofErr w:type="gramStart"/>
-      <w:r>
-        <w:rPr>
-          <w:lang w:val="en-US"/>
-        </w:rPr>
-        <w:t>name</w:t>
+        <w:t>mothers_name</w:t>
       </w:r>
       <w:proofErr w:type="spellEnd"/>
       <w:r>
         <w:rPr>
           <w:lang w:val="en-US"/>
         </w:rPr>
-        <w:t xml:space="preserve"> }</w:t>
-      </w:r>
-      <w:proofErr w:type="gramEnd"/>
-      <w:r>
-        <w:rPr>
-          <w:lang w:val="en-US"/>
-        </w:rPr>
-        <w:t>}</w:t>
-      </w:r>
-    </w:p>
-    <w:p>
-      <w:pPr>
-        <w:rPr>
-          <w:lang w:val="en-US"/>
-        </w:rPr>
-      </w:pPr>
-      <w:r>
-        <w:rPr>
-          <w:lang w:val="en-US"/>
-        </w:rPr>
-        <w:t xml:space="preserve">Mother’s Name: </w:t>
-      </w:r>
-      <w:proofErr w:type="gramStart"/>
-      <w:r>
-        <w:rPr>
-          <w:lang w:val="en-US"/>
-        </w:rPr>
-        <w:t xml:space="preserve">{{ </w:t>
+        <w:t>}}</w:t>
+      </w:r>
+    </w:p>
+    <w:p>
+      <w:pPr>
+        <w:rPr>
+          <w:lang w:val="en-US"/>
+        </w:rPr>
+      </w:pPr>
+      <w:r>
+        <w:rPr>
+          <w:lang w:val="en-US"/>
+        </w:rPr>
+        <w:t>A.M.T: {{</w:t>
       </w:r>
       <w:proofErr w:type="spellStart"/>
       <w:r>
         <w:rPr>
           <w:lang w:val="en-US"/>
         </w:rPr>
-        <w:t>mothers</w:t>
-      </w:r>
-      <w:proofErr w:type="gramEnd"/>
-      <w:r>
-        <w:rPr>
-          <w:lang w:val="en-US"/>
-        </w:rPr>
-        <w:t>_</w:t>
-      </w:r>
-      <w:proofErr w:type="gramStart"/>
-      <w:r>
-        <w:rPr>
-          <w:lang w:val="en-US"/>
-        </w:rPr>
-        <w:t>name</w:t>
+        <w:t>university_registration_number</w:t>
       </w:r>
       <w:proofErr w:type="spellEnd"/>
       <w:r>
         <w:rPr>
           <w:lang w:val="en-US"/>
         </w:rPr>
-        <w:t xml:space="preserve"> }</w:t>
-      </w:r>
-      <w:proofErr w:type="gramEnd"/>
-      <w:r>
-        <w:rPr>
-          <w:lang w:val="en-US"/>
-        </w:rPr>
-        <w:t>}</w:t>
-      </w:r>
-    </w:p>
-    <w:p>
-      <w:pPr>
-        <w:rPr>
-          <w:lang w:val="en-US"/>
-        </w:rPr>
-      </w:pPr>
-      <w:r>
-        <w:rPr>
-          <w:lang w:val="en-US"/>
-        </w:rPr>
-        <w:t xml:space="preserve">A.M.T: </w:t>
-      </w:r>
-      <w:proofErr w:type="gramStart"/>
-      <w:r>
-        <w:rPr>
-          <w:lang w:val="en-US"/>
-        </w:rPr>
-        <w:t xml:space="preserve">{{ </w:t>
-      </w:r>
+        <w:t>}}</w:t>
+      </w:r>
+    </w:p>
+    <w:p>
       <w:proofErr w:type="spellStart"/>
       <w:r>
         <w:rPr>
           <w:lang w:val="en-US"/>
         </w:rPr>
-        <w:t>registration</w:t>
-      </w:r>
-      <w:proofErr w:type="gramEnd"/>
-      <w:r>
-        <w:rPr>
-          <w:lang w:val="en-US"/>
-        </w:rPr>
-        <w:t>_</w:t>
-      </w:r>
-      <w:proofErr w:type="gramStart"/>
-      <w:r>
-        <w:rPr>
-          <w:lang w:val="en-US"/>
-        </w:rPr>
-        <w:t>number</w:t>
+        <w:t>Semister</w:t>
       </w:r>
       <w:proofErr w:type="spellEnd"/>
       <w:r>
         <w:rPr>
           <w:lang w:val="en-US"/>
         </w:rPr>
-        <w:t xml:space="preserve"> }</w:t>
-      </w:r>
-      <w:proofErr w:type="gramEnd"/>
-      <w:r>
-        <w:rPr>
-          <w:lang w:val="en-US"/>
-        </w:rPr>
-        <w:t>}</w:t>
-      </w:r>
-    </w:p>
-    <w:p>
+        <w:t>: {{</w:t>
+      </w:r>
+      <w:r>
+        <w:rPr>
+          <w:lang w:val="en-US"/>
+        </w:rPr>
+        <w:t>semester</w:t>
+      </w:r>
+      <w:r>
+        <w:rPr>
+          <w:lang w:val="en-US"/>
+        </w:rPr>
+        <w:t>}}</w:t>
+      </w:r>
+    </w:p>
+    <w:p>
+      <w:pPr>
+        <w:rPr>
+          <w:lang w:val="en-US"/>
+        </w:rPr>
+      </w:pPr>
+    </w:p>
+    <w:p>
+      <w:pPr>
+        <w:rPr>
+          <w:lang w:val="en-US"/>
+        </w:rPr>
+      </w:pPr>
+      <w:r>
+        <w:rPr>
+          <w:lang w:val="en-US"/>
+        </w:rPr>
+        <w:t>Home Address:</w:t>
+      </w:r>
+    </w:p>
+    <w:p>
+      <w:pPr>
+        <w:rPr>
+          <w:lang w:val="en-US"/>
+        </w:rPr>
+      </w:pPr>
+      <w:r>
+        <w:rPr>
+          <w:lang w:val="en-US"/>
+        </w:rPr>
+        <w:t>Street: {{</w:t>
+      </w:r>
       <w:proofErr w:type="spellStart"/>
       <w:r>
         <w:rPr>
           <w:lang w:val="en-US"/>
         </w:rPr>
-        <w:t>Semister</w:t>
+        <w:t>street_name</w:t>
       </w:r>
       <w:proofErr w:type="spellEnd"/>
       <w:r>
         <w:rPr>
           <w:lang w:val="en-US"/>
         </w:rPr>
-        <w:t xml:space="preserve">: </w:t>
-      </w:r>
-      <w:proofErr w:type="gramStart"/>
-      <w:r>
-        <w:rPr>
-          <w:lang w:val="en-US"/>
-        </w:rPr>
-        <w:t>{{ semester</w:t>
-      </w:r>
-      <w:proofErr w:type="gramEnd"/>
-      <w:r>
-        <w:rPr>
-          <w:lang w:val="en-US"/>
-        </w:rPr>
-        <w:t xml:space="preserve"> }}</w:t>
-      </w:r>
-    </w:p>
-    <w:p>
-      <w:pPr>
-        <w:rPr>
-          <w:lang w:val="en-US"/>
-        </w:rPr>
-      </w:pPr>
-    </w:p>
-    <w:p>
-      <w:pPr>
-        <w:rPr>
-          <w:lang w:val="en-US"/>
-        </w:rPr>
-      </w:pPr>
-      <w:r>
-        <w:rPr>
-          <w:lang w:val="en-US"/>
-        </w:rPr>
-        <w:t>Home Address:</w:t>
-      </w:r>
-    </w:p>
-    <w:p>
-      <w:pPr>
-        <w:rPr>
-          <w:lang w:val="en-US"/>
-        </w:rPr>
-      </w:pPr>
-      <w:r>
-        <w:rPr>
-          <w:lang w:val="en-US"/>
-        </w:rPr>
-        <w:t xml:space="preserve">Street: </w:t>
-      </w:r>
-      <w:proofErr w:type="gramStart"/>
-      <w:r>
-        <w:rPr>
-          <w:lang w:val="en-US"/>
-        </w:rPr>
-        <w:t>{{ street</w:t>
-      </w:r>
-      <w:proofErr w:type="gramEnd"/>
-      <w:r>
-        <w:rPr>
-          <w:lang w:val="en-US"/>
-        </w:rPr>
-        <w:t xml:space="preserve"> }}</w:t>
-      </w:r>
-    </w:p>
-    <w:p>
-      <w:pPr>
-        <w:rPr>
-          <w:lang w:val="en-US"/>
-        </w:rPr>
-      </w:pPr>
-      <w:r>
-        <w:rPr>
-          <w:lang w:val="en-US"/>
-        </w:rPr>
-        <w:t xml:space="preserve">Number: </w:t>
-      </w:r>
-      <w:proofErr w:type="gramStart"/>
-      <w:r>
-        <w:rPr>
-          <w:lang w:val="en-US"/>
-        </w:rPr>
-        <w:t xml:space="preserve">{{ </w:t>
+        <w:t>}}</w:t>
+      </w:r>
+    </w:p>
+    <w:p>
+      <w:pPr>
+        <w:rPr>
+          <w:lang w:val="en-US"/>
+        </w:rPr>
+      </w:pPr>
+      <w:r>
+        <w:rPr>
+          <w:lang w:val="en-US"/>
+        </w:rPr>
+        <w:t>Number: {{</w:t>
       </w:r>
       <w:proofErr w:type="spellStart"/>
       <w:r>
         <w:rPr>
           <w:lang w:val="en-US"/>
         </w:rPr>
-        <w:t>street</w:t>
-      </w:r>
-      <w:proofErr w:type="gramEnd"/>
-      <w:r>
-        <w:rPr>
-          <w:lang w:val="en-US"/>
-        </w:rPr>
-        <w:t>_</w:t>
-      </w:r>
-      <w:proofErr w:type="gramStart"/>
-      <w:r>
-        <w:rPr>
-          <w:lang w:val="en-US"/>
-        </w:rPr>
-        <w:t>number</w:t>
+        <w:t>street_number</w:t>
       </w:r>
       <w:proofErr w:type="spellEnd"/>
       <w:r>
         <w:rPr>
           <w:lang w:val="en-US"/>
         </w:rPr>
-        <w:t xml:space="preserve"> }</w:t>
-      </w:r>
-      <w:proofErr w:type="gramEnd"/>
-      <w:r>
-        <w:rPr>
-          <w:lang w:val="en-US"/>
-        </w:rPr>
-        <w:t>}</w:t>
-      </w:r>
-    </w:p>
-    <w:p>
-      <w:pPr>
-        <w:rPr>
-          <w:lang w:val="en-US"/>
-        </w:rPr>
-      </w:pPr>
-      <w:r>
-        <w:rPr>
-          <w:lang w:val="en-US"/>
-        </w:rPr>
-        <w:t xml:space="preserve">P.C: </w:t>
-      </w:r>
-      <w:proofErr w:type="gramStart"/>
-      <w:r>
-        <w:rPr>
-          <w:lang w:val="en-US"/>
-        </w:rPr>
-        <w:t xml:space="preserve">{{ </w:t>
+        <w:t>}}</w:t>
+      </w:r>
+    </w:p>
+    <w:p>
+      <w:pPr>
+        <w:rPr>
+          <w:lang w:val="en-US"/>
+        </w:rPr>
+      </w:pPr>
+      <w:r>
+        <w:rPr>
+          <w:lang w:val="en-US"/>
+        </w:rPr>
+        <w:t>P.C: {{</w:t>
       </w:r>
       <w:proofErr w:type="spellStart"/>
       <w:r>
         <w:rPr>
           <w:lang w:val="en-US"/>
         </w:rPr>
-        <w:t>postal</w:t>
-      </w:r>
-      <w:proofErr w:type="gramEnd"/>
-      <w:r>
-        <w:rPr>
-          <w:lang w:val="en-US"/>
-        </w:rPr>
-        <w:t>_</w:t>
-      </w:r>
-      <w:proofErr w:type="gramStart"/>
-      <w:r>
-        <w:rPr>
-          <w:lang w:val="en-US"/>
-        </w:rPr>
-        <w:t>code</w:t>
+        <w:t>postal_code</w:t>
       </w:r>
       <w:proofErr w:type="spellEnd"/>
       <w:r>
         <w:rPr>
           <w:lang w:val="en-US"/>
         </w:rPr>
-        <w:t xml:space="preserve"> }</w:t>
-      </w:r>
-      <w:proofErr w:type="gramEnd"/>
-      <w:r>
-        <w:rPr>
-          <w:lang w:val="en-US"/>
-        </w:rPr>
-        <w:t>}</w:t>
-      </w:r>
-    </w:p>
-    <w:p>
-      <w:pPr>
-        <w:rPr>
-          <w:lang w:val="en-US"/>
-        </w:rPr>
-      </w:pPr>
-      <w:r>
-        <w:rPr>
-          <w:lang w:val="en-US"/>
-        </w:rPr>
-        <w:t xml:space="preserve">City: </w:t>
-      </w:r>
-      <w:proofErr w:type="gramStart"/>
-      <w:r>
-        <w:rPr>
-          <w:lang w:val="en-US"/>
-        </w:rPr>
-        <w:t>{{ city</w:t>
-      </w:r>
-      <w:proofErr w:type="gramEnd"/>
-      <w:r>
-        <w:rPr>
-          <w:lang w:val="en-US"/>
-        </w:rPr>
-        <w:t xml:space="preserve"> }}</w:t>
-      </w:r>
-    </w:p>
-    <w:p>
-      <w:pPr>
-        <w:rPr>
-          <w:lang w:val="en-US"/>
-        </w:rPr>
-      </w:pPr>
-      <w:r>
-        <w:rPr>
-          <w:lang w:val="en-US"/>
-        </w:rPr>
-        <w:t xml:space="preserve">Phone: </w:t>
-      </w:r>
-      <w:proofErr w:type="gramStart"/>
-      <w:r>
-        <w:rPr>
-          <w:lang w:val="en-US"/>
-        </w:rPr>
-        <w:t xml:space="preserve">{{ </w:t>
+        <w:t>}}</w:t>
+      </w:r>
+    </w:p>
+    <w:p>
+      <w:pPr>
+        <w:rPr>
+          <w:lang w:val="en-US"/>
+        </w:rPr>
+      </w:pPr>
+      <w:r>
+        <w:rPr>
+          <w:lang w:val="en-US"/>
+        </w:rPr>
+        <w:t>City: {{</w:t>
+      </w:r>
+      <w:r>
+        <w:rPr>
+          <w:lang w:val="en-US"/>
+        </w:rPr>
+        <w:t>city</w:t>
+      </w:r>
+      <w:r>
+        <w:rPr>
+          <w:lang w:val="en-US"/>
+        </w:rPr>
+        <w:t>}}</w:t>
+      </w:r>
+    </w:p>
+    <w:p>
+      <w:pPr>
+        <w:rPr>
+          <w:lang w:val="en-US"/>
+        </w:rPr>
+      </w:pPr>
+      <w:r>
+        <w:rPr>
+          <w:lang w:val="en-US"/>
+        </w:rPr>
+        <w:t>Phone: {{</w:t>
+      </w:r>
+      <w:r>
+        <w:rPr>
+          <w:lang w:val="en-US"/>
+        </w:rPr>
+        <w:t>phone</w:t>
+      </w:r>
+      <w:r>
+        <w:rPr>
+          <w:lang w:val="en-US"/>
+        </w:rPr>
+        <w:t>}}</w:t>
+      </w:r>
+    </w:p>
+    <w:p>
+      <w:pPr>
+        <w:rPr>
+          <w:lang w:val="en-US"/>
+        </w:rPr>
+      </w:pPr>
+      <w:r>
+        <w:t>C</w:t>
+      </w:r>
+      <w:r>
+        <w:t xml:space="preserve">ell </w:t>
+      </w:r>
+      <w:r>
+        <w:t>P</w:t>
+      </w:r>
+      <w:r>
+        <w:t>hon</w:t>
+      </w:r>
+      <w:r>
+        <w:rPr>
+          <w:lang w:val="en-US"/>
+        </w:rPr>
+        <w:t>e: {{</w:t>
       </w:r>
       <w:proofErr w:type="spellStart"/>
       <w:r>
         <w:rPr>
           <w:lang w:val="en-US"/>
         </w:rPr>
-        <w:t>phone</w:t>
-      </w:r>
-      <w:proofErr w:type="gramEnd"/>
-      <w:r>
-        <w:rPr>
-          <w:lang w:val="en-US"/>
-        </w:rPr>
-        <w:t>_</w:t>
-      </w:r>
-      <w:proofErr w:type="gramStart"/>
-      <w:r>
-        <w:rPr>
-          <w:lang w:val="en-US"/>
-        </w:rPr>
-        <w:t>number</w:t>
+        <w:t>mobile_phone</w:t>
       </w:r>
       <w:proofErr w:type="spellEnd"/>
       <w:r>
         <w:rPr>
           <w:lang w:val="en-US"/>
         </w:rPr>
-        <w:t xml:space="preserve"> }</w:t>
-      </w:r>
-      <w:proofErr w:type="gramEnd"/>
-      <w:r>
-        <w:rPr>
-          <w:lang w:val="en-US"/>
-        </w:rPr>
-        <w:t>}</w:t>
-      </w:r>
-    </w:p>
-    <w:p>
-      <w:pPr>
-        <w:rPr>
-          <w:lang w:val="en-US"/>
-        </w:rPr>
-      </w:pPr>
-      <w:r>
-        <w:t>C</w:t>
-      </w:r>
-      <w:r>
-        <w:t xml:space="preserve">ell </w:t>
-      </w:r>
-      <w:r>
-        <w:t>P</w:t>
-      </w:r>
-      <w:r>
-        <w:t>hon</w:t>
-      </w:r>
-      <w:r>
-        <w:rPr>
-          <w:lang w:val="en-US"/>
-        </w:rPr>
-        <w:t xml:space="preserve">e: </w:t>
-      </w:r>
-      <w:proofErr w:type="gramStart"/>
-      <w:r>
-        <w:rPr>
-          <w:lang w:val="en-US"/>
-        </w:rPr>
-        <w:t xml:space="preserve">{{ </w:t>
-      </w:r>
-      <w:proofErr w:type="spellStart"/>
-      <w:r>
-        <w:rPr>
-          <w:lang w:val="en-US"/>
-        </w:rPr>
-        <w:t>cell</w:t>
-      </w:r>
-      <w:proofErr w:type="gramEnd"/>
-      <w:r>
-        <w:rPr>
-          <w:lang w:val="en-US"/>
-        </w:rPr>
-        <w:t>_</w:t>
-      </w:r>
-      <w:proofErr w:type="gramStart"/>
-      <w:r>
-        <w:rPr>
-          <w:lang w:val="en-US"/>
-        </w:rPr>
-        <w:t>phone</w:t>
-      </w:r>
-      <w:proofErr w:type="spellEnd"/>
-      <w:r>
-        <w:rPr>
-          <w:lang w:val="en-US"/>
-        </w:rPr>
-        <w:t xml:space="preserve"> }</w:t>
-      </w:r>
-      <w:proofErr w:type="gramEnd"/>
-      <w:r>
-        <w:rPr>
-          <w:lang w:val="en-US"/>
-        </w:rPr>
-        <w:t>}</w:t>
+        <w:t>}}</w:t>
       </w:r>
     </w:p>
     <w:p>
@@ -678,7 +446,7 @@
         <w:rPr>
           <w:lang w:val="en-US"/>
         </w:rPr>
-        <w:t xml:space="preserve"> {{ </w:t>
+        <w:t xml:space="preserve"> {{</w:t>
       </w:r>
       <w:r>
         <w:rPr>
@@ -690,7 +458,7 @@
         <w:rPr>
           <w:lang w:val="en-US"/>
         </w:rPr>
-        <w:t xml:space="preserve"> }}/{{ </w:t>
+        <w:t>}}/{{</w:t>
       </w:r>
       <w:r>
         <w:rPr>
@@ -702,7 +470,7 @@
         <w:rPr>
           <w:lang w:val="en-US"/>
         </w:rPr>
-        <w:t xml:space="preserve"> }}/{{ </w:t>
+        <w:t>}}/{{</w:t>
       </w:r>
       <w:r>
         <w:rPr>
@@ -714,7 +482,7 @@
         <w:rPr>
           <w:lang w:val="en-US"/>
         </w:rPr>
-        <w:t xml:space="preserve"> }}</w:t>
+        <w:t>}}</w:t>
       </w:r>
     </w:p>
     <w:p>
@@ -777,228 +545,80 @@
       </w:r>
     </w:p>
     <w:p>
-      <w:proofErr w:type="gramStart"/>
       <w:r>
         <w:t>{{</w:t>
       </w:r>
-      <w:r>
-        <w:t xml:space="preserve"> </w:t>
-      </w:r>
       <w:proofErr w:type="spellStart"/>
       <w:r>
-        <w:t>certificate</w:t>
-      </w:r>
-      <w:proofErr w:type="gramEnd"/>
-      <w:r>
-        <w:t>_of_</w:t>
-      </w:r>
-      <w:proofErr w:type="gramStart"/>
-      <w:r>
-        <w:t>studies</w:t>
+        <w:t>what_need</w:t>
       </w:r>
       <w:proofErr w:type="spellEnd"/>
       <w:r>
-        <w:t xml:space="preserve"> }</w:t>
-      </w:r>
-      <w:proofErr w:type="gramEnd"/>
-      <w:r>
-        <w:t>}</w:t>
-      </w:r>
-    </w:p>
-    <w:p>
-      <w:proofErr w:type="gramStart"/>
-      <w:r>
-        <w:t xml:space="preserve">{{ </w:t>
+        <w:t>}}</w:t>
+      </w:r>
+    </w:p>
+    <w:p/>
+    <w:p/>
+    <w:p>
+      <w:pPr>
+        <w:rPr>
+          <w:lang w:val="en-US"/>
+        </w:rPr>
+      </w:pPr>
+    </w:p>
+    <w:p>
+      <w:pPr>
+        <w:rPr>
+          <w:lang w:val="en-US"/>
+        </w:rPr>
+      </w:pPr>
+      <w:r>
+        <w:rPr>
+          <w:lang w:val="en-US"/>
+        </w:rPr>
+        <w:t>To use it for:</w:t>
+      </w:r>
+    </w:p>
+    <w:p>
+      <w:pPr>
+        <w:rPr>
+          <w:lang w:val="en-US"/>
+        </w:rPr>
+      </w:pPr>
+      <w:r>
+        <w:rPr>
+          <w:lang w:val="en-US"/>
+        </w:rPr>
+        <w:t>{{</w:t>
       </w:r>
       <w:proofErr w:type="spellStart"/>
       <w:r>
-        <w:t>detailed</w:t>
-      </w:r>
-      <w:proofErr w:type="gramEnd"/>
-      <w:r>
-        <w:t>_</w:t>
-      </w:r>
-      <w:proofErr w:type="gramStart"/>
-      <w:r>
-        <w:t>score</w:t>
+        <w:rPr>
+          <w:lang w:val="en-US"/>
+        </w:rPr>
+        <w:t>what_for</w:t>
       </w:r>
       <w:proofErr w:type="spellEnd"/>
       <w:r>
-        <w:t xml:space="preserve"> }</w:t>
-      </w:r>
-      <w:proofErr w:type="gramEnd"/>
-      <w:r>
-        <w:t>}</w:t>
-      </w:r>
-    </w:p>
-    <w:p>
-      <w:pPr>
-        <w:rPr>
-          <w:lang w:val="en-US"/>
-        </w:rPr>
-      </w:pPr>
-      <w:proofErr w:type="gramStart"/>
-      <w:r>
-        <w:t xml:space="preserve">{{ </w:t>
-      </w:r>
-      <w:r>
-        <w:rPr>
-          <w:lang w:val="en-US"/>
-        </w:rPr>
-        <w:t>other</w:t>
-      </w:r>
-      <w:proofErr w:type="gramEnd"/>
-      <w:r>
-        <w:rPr>
-          <w:lang w:val="en-US"/>
-        </w:rPr>
-        <w:t xml:space="preserve"> }}</w:t>
-      </w:r>
-    </w:p>
-    <w:p>
-      <w:pPr>
-        <w:rPr>
-          <w:lang w:val="en-US"/>
-        </w:rPr>
-      </w:pPr>
-    </w:p>
-    <w:p>
-      <w:pPr>
-        <w:rPr>
-          <w:lang w:val="en-US"/>
-        </w:rPr>
-      </w:pPr>
-      <w:r>
-        <w:rPr>
-          <w:lang w:val="en-US"/>
-        </w:rPr>
-        <w:t>To use it for:</w:t>
-      </w:r>
-    </w:p>
-    <w:p>
-      <w:pPr>
-        <w:rPr>
-          <w:lang w:val="en-US"/>
-        </w:rPr>
-      </w:pPr>
-      <w:proofErr w:type="gramStart"/>
-      <w:r>
-        <w:rPr>
-          <w:lang w:val="en-US"/>
-        </w:rPr>
-        <w:t xml:space="preserve">{{ </w:t>
-      </w:r>
-      <w:proofErr w:type="spellStart"/>
-      <w:r>
-        <w:rPr>
-          <w:lang w:val="en-US"/>
-        </w:rPr>
-        <w:t>every</w:t>
-      </w:r>
-      <w:proofErr w:type="gramEnd"/>
-      <w:r>
-        <w:rPr>
-          <w:lang w:val="en-US"/>
-        </w:rPr>
-        <w:t>_</w:t>
-      </w:r>
-      <w:proofErr w:type="gramStart"/>
-      <w:r>
-        <w:rPr>
-          <w:lang w:val="en-US"/>
-        </w:rPr>
-        <w:t>use</w:t>
-      </w:r>
-      <w:proofErr w:type="spellEnd"/>
-      <w:r>
-        <w:rPr>
-          <w:lang w:val="en-US"/>
-        </w:rPr>
-        <w:t xml:space="preserve"> }</w:t>
-      </w:r>
-      <w:proofErr w:type="gramEnd"/>
-      <w:r>
-        <w:rPr>
-          <w:lang w:val="en-US"/>
-        </w:rPr>
-        <w:t>}</w:t>
-      </w:r>
-    </w:p>
-    <w:p>
-      <w:pPr>
-        <w:rPr>
-          <w:lang w:val="en-US"/>
-        </w:rPr>
-      </w:pPr>
-      <w:proofErr w:type="gramStart"/>
-      <w:r>
-        <w:rPr>
-          <w:lang w:val="en-US"/>
-        </w:rPr>
-        <w:t xml:space="preserve">{{ </w:t>
-      </w:r>
-      <w:proofErr w:type="spellStart"/>
-      <w:r>
-        <w:rPr>
-          <w:lang w:val="en-US"/>
-        </w:rPr>
-        <w:t>tax</w:t>
-      </w:r>
-      <w:proofErr w:type="gramEnd"/>
-      <w:r>
-        <w:rPr>
-          <w:lang w:val="en-US"/>
-        </w:rPr>
-        <w:t>_</w:t>
-      </w:r>
-      <w:proofErr w:type="gramStart"/>
-      <w:r>
-        <w:rPr>
-          <w:lang w:val="en-US"/>
-        </w:rPr>
-        <w:t>office</w:t>
-      </w:r>
-      <w:proofErr w:type="spellEnd"/>
-      <w:r>
-        <w:rPr>
-          <w:lang w:val="en-US"/>
-        </w:rPr>
-        <w:t xml:space="preserve"> }</w:t>
-      </w:r>
-      <w:proofErr w:type="gramEnd"/>
-      <w:r>
-        <w:rPr>
-          <w:lang w:val="en-US"/>
-        </w:rPr>
-        <w:t>}</w:t>
-      </w:r>
-    </w:p>
-    <w:p>
-      <w:pPr>
-        <w:rPr>
-          <w:lang w:val="en-US"/>
-        </w:rPr>
-      </w:pPr>
-      <w:proofErr w:type="gramStart"/>
-      <w:r>
-        <w:rPr>
-          <w:lang w:val="en-US"/>
-        </w:rPr>
-        <w:t xml:space="preserve">{{ </w:t>
-      </w:r>
-      <w:r>
-        <w:rPr>
-          <w:lang w:val="en-US"/>
-        </w:rPr>
-        <w:t>recruitment</w:t>
-      </w:r>
-      <w:proofErr w:type="gramEnd"/>
-      <w:r>
-        <w:rPr>
-          <w:lang w:val="en-US"/>
-        </w:rPr>
-        <w:t xml:space="preserve"> }}</w:t>
-      </w:r>
+        <w:rPr>
+          <w:lang w:val="en-US"/>
+        </w:rPr>
+        <w:t>}}</w:t>
+      </w:r>
+    </w:p>
+    <w:p>
+      <w:pPr>
+        <w:rPr>
+          <w:lang w:val="en-US"/>
+        </w:rPr>
+      </w:pPr>
+    </w:p>
+    <w:p>
+      <w:pPr>
+        <w:rPr>
+          <w:lang w:val="en-US"/>
+        </w:rPr>
+      </w:pPr>
     </w:p>
     <w:p>
       <w:pPr>

</xml_diff>